<commit_message>
Latest changes in the user guides for CUBE and ZSight
</commit_message>
<xml_diff>
--- a/2026/CUBE/Cube User Guide/DigDev_CUBE_User_Guide_UGU_v1.1.docx
+++ b/2026/CUBE/Cube User Guide/DigDev_CUBE_User_Guide_UGU_v1.1.docx
@@ -188,20 +188,6 @@
                 <w:sz w:val="20"/>
                 <w:szCs w:val="20"/>
               </w:rPr>
-              <w:t>UGU</w:t>
-            </w:r>
-            <w:r>
-              <w:rPr>
-                <w:sz w:val="20"/>
-                <w:szCs w:val="20"/>
-              </w:rPr>
-              <w:t>_</w:t>
-            </w:r>
-            <w:r>
-              <w:rPr>
-                <w:sz w:val="20"/>
-                <w:szCs w:val="20"/>
-              </w:rPr>
               <w:t>v1.</w:t>
             </w:r>
             <w:r>
@@ -251,7 +237,14 @@
                 <w:sz w:val="20"/>
                 <w:szCs w:val="20"/>
               </w:rPr>
-              <w:t>CUBE</w:t>
+              <w:t>C</w:t>
+            </w:r>
+            <w:r>
+              <w:rPr>
+                <w:sz w:val="20"/>
+                <w:szCs w:val="20"/>
+              </w:rPr>
+              <w:t>ube</w:t>
             </w:r>
           </w:p>
         </w:tc>
@@ -14778,13 +14771,8 @@
           <w:numId w:val="27"/>
         </w:numPr>
       </w:pPr>
-      <w:proofErr w:type="spellStart"/>
-      <w:r>
-        <w:t>ZTERS</w:t>
-      </w:r>
-      <w:proofErr w:type="spellEnd"/>
-      <w:r>
-        <w:t xml:space="preserve"> team members,</w:t>
+      <w:r>
+        <w:t>ZTERS team members,</w:t>
       </w:r>
       <w:r>
         <w:t xml:space="preserve"> who require an understanding of the CUBE platform for operational, coordination, or support purposes.</w:t>
@@ -15163,23 +15151,7 @@
                 <w:sz w:val="20"/>
                 <w:szCs w:val="20"/>
               </w:rPr>
-              <w:t xml:space="preserve"> to manage customers, service locations, operational resources, and reporting tools within the </w:t>
-            </w:r>
-            <w:proofErr w:type="spellStart"/>
-            <w:r>
-              <w:rPr>
-                <w:sz w:val="20"/>
-                <w:szCs w:val="20"/>
-              </w:rPr>
-              <w:t>ZTERS</w:t>
-            </w:r>
-            <w:proofErr w:type="spellEnd"/>
-            <w:r>
-              <w:rPr>
-                <w:sz w:val="20"/>
-                <w:szCs w:val="20"/>
-              </w:rPr>
-              <w:t xml:space="preserve"> platform.</w:t>
+              <w:t xml:space="preserve"> to manage customers, service locations, operational resources, and reporting tools within the ZTERS platform.</w:t>
             </w:r>
           </w:p>
         </w:tc>
@@ -15238,7 +15210,6 @@
                 <w:szCs w:val="20"/>
               </w:rPr>
             </w:pPr>
-            <w:proofErr w:type="spellStart"/>
             <w:r>
               <w:rPr>
                 <w:sz w:val="20"/>
@@ -15246,7 +15217,6 @@
               </w:rPr>
               <w:t>CWS</w:t>
             </w:r>
-            <w:proofErr w:type="spellEnd"/>
           </w:p>
         </w:tc>
         <w:tc>
@@ -15265,39 +15235,7 @@
                 <w:sz w:val="20"/>
                 <w:szCs w:val="20"/>
               </w:rPr>
-              <w:t xml:space="preserve">The </w:t>
-            </w:r>
-            <w:proofErr w:type="spellStart"/>
-            <w:r>
-              <w:rPr>
-                <w:sz w:val="20"/>
-                <w:szCs w:val="20"/>
-              </w:rPr>
-              <w:t>CWS</w:t>
-            </w:r>
-            <w:proofErr w:type="spellEnd"/>
-            <w:r>
-              <w:rPr>
-                <w:sz w:val="20"/>
-                <w:szCs w:val="20"/>
-              </w:rPr>
-              <w:t xml:space="preserve"> (Commercial Waste Services) is a functional group within </w:t>
-            </w:r>
-            <w:proofErr w:type="spellStart"/>
-            <w:r>
-              <w:rPr>
-                <w:sz w:val="20"/>
-                <w:szCs w:val="20"/>
-              </w:rPr>
-              <w:t>ZTERS</w:t>
-            </w:r>
-            <w:proofErr w:type="spellEnd"/>
-            <w:r>
-              <w:rPr>
-                <w:sz w:val="20"/>
-                <w:szCs w:val="20"/>
-              </w:rPr>
-              <w:t xml:space="preserve"> responsible for managing waste service operations, including monitoring tools and asset-related functionalities.</w:t>
+              <w:t>The CWS (Commercial Waste Services) is a functional group within ZTERS responsible for managing waste service operations, including monitoring tools and asset-related functionalities.</w:t>
             </w:r>
           </w:p>
         </w:tc>
@@ -15947,7 +15885,6 @@
                 <w:szCs w:val="20"/>
               </w:rPr>
             </w:pPr>
-            <w:proofErr w:type="spellStart"/>
             <w:r>
               <w:rPr>
                 <w:sz w:val="20"/>
@@ -15955,7 +15892,6 @@
               </w:rPr>
               <w:t>VM</w:t>
             </w:r>
-            <w:proofErr w:type="spellEnd"/>
           </w:p>
         </w:tc>
         <w:tc>
@@ -15991,21 +15927,12 @@
                 <w:szCs w:val="20"/>
               </w:rPr>
             </w:pPr>
-            <w:proofErr w:type="spellStart"/>
-            <w:r>
-              <w:rPr>
-                <w:sz w:val="20"/>
-                <w:szCs w:val="20"/>
-              </w:rPr>
-              <w:t>VM</w:t>
-            </w:r>
-            <w:proofErr w:type="spellEnd"/>
-            <w:r>
-              <w:rPr>
-                <w:sz w:val="20"/>
-                <w:szCs w:val="20"/>
-              </w:rPr>
-              <w:t xml:space="preserve"> Ticket</w:t>
+            <w:r>
+              <w:rPr>
+                <w:sz w:val="20"/>
+                <w:szCs w:val="20"/>
+              </w:rPr>
+              <w:t>VM Ticket</w:t>
             </w:r>
           </w:p>
         </w:tc>
@@ -16348,15 +16275,7 @@
     </w:p>
     <w:p>
       <w:r>
-        <w:t xml:space="preserve">The CUBE platform is a web-based application designed to support the management of customers, service locations, operational resources, and internal activities within the </w:t>
-      </w:r>
-      <w:proofErr w:type="spellStart"/>
-      <w:r>
-        <w:t>ZTERS</w:t>
-      </w:r>
-      <w:proofErr w:type="spellEnd"/>
-      <w:r>
-        <w:t xml:space="preserve"> ecosystem. It provides a centralized interface where users can access and manage data required for daily operations.</w:t>
+        <w:t>The CUBE platform is a web-based application designed to support the management of customers, service locations, operational resources, and internal activities within the ZTERS ecosystem. It provides a centralized interface where users can access and manage data required for daily operations.</w:t>
       </w:r>
     </w:p>
     <w:p>
@@ -16811,17 +16730,12 @@
         <w:pStyle w:val="Heading1"/>
       </w:pPr>
       <w:bookmarkStart w:id="14" w:name="_Toc232847587"/>
-      <w:proofErr w:type="spellStart"/>
       <w:r>
         <w:lastRenderedPageBreak/>
         <w:t>Dashboard</w:t>
       </w:r>
       <w:r>
-        <w:t>z</w:t>
-      </w:r>
-      <w:proofErr w:type="spellEnd"/>
-      <w:r>
-        <w:t xml:space="preserve"> Section</w:t>
+        <w:t>z Section</w:t>
       </w:r>
       <w:bookmarkEnd w:id="14"/>
     </w:p>
@@ -17226,7 +17140,15 @@
       </w:r>
       <w:proofErr w:type="gramEnd"/>
       <w:r>
-        <w:t xml:space="preserve"> name, current status, and recent activity information. Users can use this section to monitor their assigned providers and quickly identify providers that may require attention. The View All option allows users to open the complete provider list when additional review is needed.</w:t>
+        <w:t xml:space="preserve"> name, </w:t>
+      </w:r>
+      <w:proofErr w:type="gramStart"/>
+      <w:r>
+        <w:t>current status</w:t>
+      </w:r>
+      <w:proofErr w:type="gramEnd"/>
+      <w:r>
+        <w:t>, and recent activity information. Users can use this section to monitor their assigned providers and quickly identify providers that may require attention. The View All option allows users to open the complete provider list when additional review is needed.</w:t>
       </w:r>
     </w:p>
     <w:p>
@@ -17341,40 +17263,19 @@
         <w:pStyle w:val="Heading3"/>
       </w:pPr>
       <w:bookmarkStart w:id="23" w:name="_Toc232847596"/>
-      <w:proofErr w:type="spellStart"/>
-      <w:r>
-        <w:t>VM</w:t>
-      </w:r>
-      <w:proofErr w:type="spellEnd"/>
-      <w:r>
-        <w:t xml:space="preserve"> Tickets</w:t>
+      <w:r>
+        <w:t>VM Tickets</w:t>
       </w:r>
       <w:bookmarkEnd w:id="23"/>
     </w:p>
     <w:p>
       <w:r>
-        <w:t xml:space="preserve">The </w:t>
-      </w:r>
-      <w:proofErr w:type="spellStart"/>
-      <w:r>
-        <w:t>VM</w:t>
-      </w:r>
-      <w:proofErr w:type="spellEnd"/>
-      <w:r>
-        <w:t xml:space="preserve"> Tickets section provides an overview of the vendor management ticket queue. It displays the number of open tickets assigned to the current user and the total number of open tickets for the team.</w:t>
-      </w:r>
-    </w:p>
-    <w:p>
-      <w:r>
-        <w:t xml:space="preserve">The section also includes a status breakdown for tickets, such as pending, assigned, in progress, submitted for approval, and stalled. This helps users understand the current state of the </w:t>
-      </w:r>
-      <w:proofErr w:type="spellStart"/>
-      <w:r>
-        <w:t>VM</w:t>
-      </w:r>
-      <w:proofErr w:type="spellEnd"/>
-      <w:r>
-        <w:t xml:space="preserve"> ticket queue and identify whether any tickets require follow-up. The View All option allows users to open the complete ticket list.</w:t>
+        <w:t>The VM Tickets section provides an overview of the vendor management ticket queue. It displays the number of open tickets assigned to the current user and the total number of open tickets for the team.</w:t>
+      </w:r>
+    </w:p>
+    <w:p>
+      <w:r>
+        <w:t>The section also includes a status breakdown for tickets, such as pending, assigned, in progress, submitted for approval, and stalled. This helps users understand the current state of the VM ticket queue and identify whether any tickets require follow-up. The View All option allows users to open the complete ticket list.</w:t>
       </w:r>
     </w:p>
     <w:p>
@@ -17544,15 +17445,7 @@
         <w:t>Provider Lifecycle Distribution</w:t>
       </w:r>
       <w:r>
-        <w:t xml:space="preserve"> chart shows service providers grouped by lifecycle status, such as Draft, Pending Verification, Authorized, Verified, and </w:t>
-      </w:r>
-      <w:proofErr w:type="spellStart"/>
-      <w:r>
-        <w:t>DNU</w:t>
-      </w:r>
-      <w:proofErr w:type="spellEnd"/>
-      <w:r>
-        <w:t xml:space="preserve">. This chart helps users understand how providers are distributed across different stages of the provider’s lifecycle. </w:t>
+        <w:t xml:space="preserve"> chart shows service providers grouped by lifecycle status, such as Draft, Pending Verification, Authorized, Verified, and DNU. This chart helps users understand how providers are distributed across different stages of the provider’s lifecycle. </w:t>
       </w:r>
     </w:p>
     <w:p>
@@ -18426,15 +18319,7 @@
     </w:p>
     <w:p>
       <w:r>
-        <w:t xml:space="preserve">The Provider Lifecycle Distribution chart shows providers grouped by lifecycle status, such as Draft, Pending Verification, Authorized, Verified, and </w:t>
-      </w:r>
-      <w:proofErr w:type="spellStart"/>
-      <w:r>
-        <w:t>DNU</w:t>
-      </w:r>
-      <w:proofErr w:type="spellEnd"/>
-      <w:r>
-        <w:t xml:space="preserve">. This helps users understand how providers are distributed across key lifecycle stages. </w:t>
+        <w:t xml:space="preserve">The Provider Lifecycle Distribution chart shows providers grouped by lifecycle status, such as Draft, Pending Verification, Authorized, Verified, and DNU. This helps users understand how providers are distributed across key lifecycle stages. </w:t>
       </w:r>
     </w:p>
     <w:p>
@@ -19760,12 +19645,10 @@
         <w:pStyle w:val="Heading1"/>
       </w:pPr>
       <w:bookmarkStart w:id="58" w:name="_Toc232847631"/>
-      <w:proofErr w:type="spellStart"/>
       <w:r>
         <w:lastRenderedPageBreak/>
         <w:t>Customerz</w:t>
       </w:r>
-      <w:proofErr w:type="spellEnd"/>
       <w:r>
         <w:t xml:space="preserve"> section</w:t>
       </w:r>
@@ -20333,12 +20216,10 @@
         <w:pStyle w:val="Heading1"/>
       </w:pPr>
       <w:bookmarkStart w:id="85" w:name="_Toc232847658"/>
-      <w:proofErr w:type="spellStart"/>
       <w:r>
         <w:lastRenderedPageBreak/>
         <w:t>Operationz</w:t>
       </w:r>
-      <w:proofErr w:type="spellEnd"/>
       <w:r>
         <w:t xml:space="preserve"> section</w:t>
       </w:r>
@@ -20384,15 +20265,7 @@
         <w:t>Service Providers</w:t>
       </w:r>
       <w:r>
-        <w:t xml:space="preserve"> module displays the list of service providers registered in CUBE. Users can search, sort, and filter provider records from the table. Each record shows key provider information such as company name, verification status, </w:t>
-      </w:r>
-      <w:proofErr w:type="spellStart"/>
-      <w:r>
-        <w:t>DNU</w:t>
-      </w:r>
-      <w:proofErr w:type="spellEnd"/>
-      <w:r>
-        <w:t xml:space="preserve"> status, service provider ID, phone number, address, city, and state. The Actions column allows users to view, edit, select, or access additional options for a provider.</w:t>
+        <w:t xml:space="preserve"> module displays the list of service providers registered in CUBE. Users can search, sort, and filter provider records from the table. Each record shows key provider information such as company name, verification status, DNU status, service provider ID, phone number, address, city, and state. The Actions column allows users to view, edit, select, or access additional options for a provider.</w:t>
       </w:r>
     </w:p>
     <w:p>
@@ -21689,13 +21562,8 @@
         <w:pStyle w:val="Heading2"/>
       </w:pPr>
       <w:bookmarkStart w:id="91" w:name="_Toc232847664"/>
-      <w:proofErr w:type="spellStart"/>
-      <w:r>
-        <w:t>VM</w:t>
-      </w:r>
-      <w:proofErr w:type="spellEnd"/>
-      <w:r>
-        <w:t xml:space="preserve"> Tickets</w:t>
+      <w:r>
+        <w:t>VM Tickets</w:t>
       </w:r>
       <w:bookmarkEnd w:id="91"/>
     </w:p>
@@ -21762,13 +21630,8 @@
         <w:pStyle w:val="Heading2"/>
       </w:pPr>
       <w:bookmarkStart w:id="95" w:name="_Toc232847668"/>
-      <w:proofErr w:type="spellStart"/>
-      <w:r>
-        <w:t>VM</w:t>
-      </w:r>
-      <w:proofErr w:type="spellEnd"/>
-      <w:r>
-        <w:t xml:space="preserve"> Activities</w:t>
+      <w:r>
+        <w:t>VM Activities</w:t>
       </w:r>
       <w:bookmarkEnd w:id="95"/>
     </w:p>
@@ -21881,12 +21744,10 @@
         <w:pStyle w:val="Heading1"/>
       </w:pPr>
       <w:bookmarkStart w:id="101" w:name="_Toc232847674"/>
-      <w:proofErr w:type="spellStart"/>
       <w:r>
         <w:lastRenderedPageBreak/>
         <w:t>Administratorz</w:t>
       </w:r>
-      <w:proofErr w:type="spellEnd"/>
       <w:r>
         <w:t xml:space="preserve"> section</w:t>
       </w:r>
@@ -22187,12 +22048,10 @@
         <w:pStyle w:val="Heading1"/>
       </w:pPr>
       <w:bookmarkStart w:id="112" w:name="_Toc232847685"/>
-      <w:proofErr w:type="spellStart"/>
       <w:r>
         <w:lastRenderedPageBreak/>
         <w:t>Userz</w:t>
       </w:r>
-      <w:proofErr w:type="spellEnd"/>
       <w:r>
         <w:t xml:space="preserve"> section</w:t>
       </w:r>
@@ -22347,12 +22206,10 @@
         <w:pStyle w:val="Heading1"/>
       </w:pPr>
       <w:bookmarkStart w:id="117" w:name="_Toc232847690"/>
-      <w:proofErr w:type="spellStart"/>
       <w:r>
         <w:lastRenderedPageBreak/>
         <w:t>Zeepz</w:t>
       </w:r>
-      <w:proofErr w:type="spellEnd"/>
       <w:r>
         <w:t xml:space="preserve"> Section</w:t>
       </w:r>
@@ -22469,14 +22326,12 @@
         <w:t xml:space="preserve"> </w:t>
       </w:r>
       <w:bookmarkStart w:id="122" w:name="_Toc232847695"/>
-      <w:proofErr w:type="spellStart"/>
       <w:r>
         <w:t>Report</w:t>
       </w:r>
       <w:r>
         <w:t>z</w:t>
       </w:r>
-      <w:proofErr w:type="spellEnd"/>
       <w:r>
         <w:t xml:space="preserve"> section</w:t>
       </w:r>
@@ -24185,7 +24040,6 @@
                 <w:szCs w:val="18"/>
               </w:rPr>
             </w:pPr>
-            <w:proofErr w:type="spellStart"/>
             <w:r>
               <w:rPr>
                 <w:b/>
@@ -24196,7 +24050,6 @@
               </w:rPr>
               <w:t>CWS</w:t>
             </w:r>
-            <w:proofErr w:type="spellEnd"/>
           </w:p>
         </w:tc>
         <w:tc>
@@ -24215,7 +24068,6 @@
                 <w:szCs w:val="18"/>
               </w:rPr>
             </w:pPr>
-            <w:proofErr w:type="spellStart"/>
             <w:r>
               <w:rPr>
                 <w:b/>
@@ -24226,7 +24078,6 @@
               </w:rPr>
               <w:t>VM</w:t>
             </w:r>
-            <w:proofErr w:type="spellEnd"/>
           </w:p>
         </w:tc>
         <w:tc>
@@ -31247,23 +31098,13 @@
                 <w:szCs w:val="20"/>
               </w:rPr>
             </w:pPr>
-            <w:proofErr w:type="spellStart"/>
-            <w:r>
-              <w:rPr>
-                <w:rFonts w:cs="Arial"/>
-                <w:sz w:val="20"/>
-                <w:szCs w:val="20"/>
-              </w:rPr>
-              <w:t>VM</w:t>
-            </w:r>
-            <w:proofErr w:type="spellEnd"/>
-            <w:r>
-              <w:rPr>
-                <w:rFonts w:cs="Arial"/>
-                <w:sz w:val="20"/>
-                <w:szCs w:val="20"/>
-              </w:rPr>
-              <w:t xml:space="preserve"> Activities</w:t>
+            <w:r>
+              <w:rPr>
+                <w:rFonts w:cs="Arial"/>
+                <w:sz w:val="20"/>
+                <w:szCs w:val="20"/>
+              </w:rPr>
+              <w:t>VM Activities</w:t>
             </w:r>
           </w:p>
         </w:tc>
@@ -40251,7 +40092,6 @@
       </w:rPr>
       <w:t xml:space="preserve">2025 </w:t>
     </w:r>
-    <w:proofErr w:type="spellStart"/>
     <w:r>
       <w:rPr>
         <w:sz w:val="12"/>
@@ -40259,7 +40099,6 @@
       </w:rPr>
       <w:t>ZTERS</w:t>
     </w:r>
-    <w:proofErr w:type="spellEnd"/>
     <w:r>
       <w:rPr>
         <w:sz w:val="12"/>

</xml_diff>